<commit_message>
Added Admin user type, admin dashboard, and other changes
</commit_message>
<xml_diff>
--- a/Documents/docs-Spr2026/Client Meeting Log - VisPortfolio.docx
+++ b/Documents/docs-Spr2026/Client Meeting Log - VisPortfolio.docx
@@ -1286,29 +1286,16 @@
         </w:rPr>
         <w:t>Organize documents visually </w:t>
       </w:r>
-    </w:p>
-    <w:p>
-      <w:pPr>
-        <w:spacing w:after="200" w:line="240" w:lineRule="auto"/>
-        <w:ind w:left="1440"/>
-        <w:rPr>
-          <w:rFonts w:ascii="Times New Roman" w:eastAsia="Times New Roman" w:hAnsi="Times New Roman" w:cs="Times New Roman"/>
-          <w:color w:val="000000"/>
-          <w:kern w:val="0"/>
-          <w14:ligatures w14:val="none"/>
-        </w:rPr>
-      </w:pPr>
-      <w:r>
-        <w:rPr>
-          <w:rFonts w:ascii="Cambria" w:eastAsia="Times New Roman" w:hAnsi="Cambria" w:cs="Times New Roman"/>
-          <w:color w:val="000000"/>
-          <w:kern w:val="0"/>
-          <w:sz w:val="22"/>
-          <w:szCs w:val="22"/>
-          <w14:ligatures w14:val="none"/>
-        </w:rPr>
-        <w:lastRenderedPageBreak/>
-        <w:t>·        </w:t>
+      <w:r>
+        <w:rPr>
+          <w:rFonts w:ascii="Cambria" w:eastAsia="Times New Roman" w:hAnsi="Cambria" w:cs="Times New Roman"/>
+          <w:color w:val="000000"/>
+          <w:kern w:val="0"/>
+          <w:sz w:val="22"/>
+          <w:szCs w:val="22"/>
+          <w14:ligatures w14:val="none"/>
+        </w:rPr>
+        <w:t> </w:t>
       </w:r>
     </w:p>
     <w:p>
@@ -1337,6 +1324,7 @@
           <w:szCs w:val="30"/>
           <w14:ligatures w14:val="none"/>
         </w:rPr>
+        <w:lastRenderedPageBreak/>
         <w:t>Non-Functional Requirements</w:t>
       </w:r>
     </w:p>
@@ -2399,15 +2387,7 @@
       <w:pPr>
         <w:spacing w:after="200" w:line="240" w:lineRule="auto"/>
         <w:rPr>
-          <w:rFonts w:ascii="Times New Roman" w:eastAsia="Times New Roman" w:hAnsi="Times New Roman" w:cs="Times New Roman"/>
-          <w:color w:val="000000"/>
-          <w:kern w:val="0"/>
-          <w14:ligatures w14:val="none"/>
-        </w:rPr>
-      </w:pPr>
-      <w:r>
-        <w:rPr>
-          <w:rFonts w:ascii="Cambria" w:eastAsia="Times New Roman" w:hAnsi="Cambria" w:cs="Times New Roman"/>
+          <w:rFonts w:ascii="Arial" w:eastAsia="Times New Roman" w:hAnsi="Arial" w:cs="Arial"/>
           <w:b/>
           <w:bCs/>
           <w:color w:val="000000"/>
@@ -2416,6 +2396,45 @@
           <w:szCs w:val="28"/>
           <w14:ligatures w14:val="none"/>
         </w:rPr>
+      </w:pPr>
+    </w:p>
+    <w:p>
+      <w:pPr>
+        <w:spacing w:after="200" w:line="240" w:lineRule="auto"/>
+        <w:rPr>
+          <w:rFonts w:ascii="Arial" w:eastAsia="Times New Roman" w:hAnsi="Arial" w:cs="Arial"/>
+          <w:b/>
+          <w:bCs/>
+          <w:color w:val="000000"/>
+          <w:kern w:val="0"/>
+          <w:sz w:val="28"/>
+          <w:szCs w:val="28"/>
+          <w14:ligatures w14:val="none"/>
+        </w:rPr>
+      </w:pPr>
+    </w:p>
+    <w:p>
+      <w:pPr>
+        <w:spacing w:after="200" w:line="240" w:lineRule="auto"/>
+        <w:rPr>
+          <w:rFonts w:ascii="Times New Roman" w:eastAsia="Times New Roman" w:hAnsi="Times New Roman" w:cs="Times New Roman"/>
+          <w:color w:val="000000"/>
+          <w:kern w:val="0"/>
+          <w14:ligatures w14:val="none"/>
+        </w:rPr>
+      </w:pPr>
+      <w:r>
+        <w:rPr>
+          <w:rFonts w:ascii="Cambria" w:eastAsia="Times New Roman" w:hAnsi="Cambria" w:cs="Times New Roman"/>
+          <w:b/>
+          <w:bCs/>
+          <w:color w:val="000000"/>
+          <w:kern w:val="0"/>
+          <w:sz w:val="28"/>
+          <w:szCs w:val="28"/>
+          <w14:ligatures w14:val="none"/>
+        </w:rPr>
+        <w:lastRenderedPageBreak/>
         <w:t>3. Requirement Prioritization</w:t>
       </w:r>
     </w:p>
@@ -2478,7 +2497,6 @@
                 <w:szCs w:val="28"/>
                 <w14:ligatures w14:val="none"/>
               </w:rPr>
-              <w:lastRenderedPageBreak/>
               <w:t>Requirement</w:t>
             </w:r>
           </w:p>
@@ -3472,362 +3490,6 @@
           </w:p>
         </w:tc>
       </w:tr>
-      <w:tr>
-        <w:trPr>
-          <w:trHeight w:val="585"/>
-        </w:trPr>
-        <w:tc>
-          <w:tcPr>
-            <w:tcW w:w="0" w:type="auto"/>
-            <w:tcBorders>
-              <w:top w:val="single" w:sz="12" w:space="0" w:color="000000"/>
-              <w:left w:val="single" w:sz="12" w:space="0" w:color="000000"/>
-              <w:bottom w:val="single" w:sz="12" w:space="0" w:color="000000"/>
-              <w:right w:val="single" w:sz="12" w:space="0" w:color="000000"/>
-            </w:tcBorders>
-            <w:tcMar>
-              <w:top w:w="0" w:type="dxa"/>
-              <w:left w:w="100" w:type="dxa"/>
-              <w:bottom w:w="0" w:type="dxa"/>
-              <w:right w:w="100" w:type="dxa"/>
-            </w:tcMar>
-            <w:hideMark/>
-          </w:tcPr>
-          <w:p>
-            <w:pPr>
-              <w:spacing w:after="200" w:line="240" w:lineRule="auto"/>
-              <w:rPr>
-                <w:rFonts w:ascii="Times New Roman" w:eastAsia="Times New Roman" w:hAnsi="Times New Roman" w:cs="Times New Roman"/>
-                <w:kern w:val="0"/>
-                <w14:ligatures w14:val="none"/>
-              </w:rPr>
-            </w:pPr>
-            <w:r>
-              <w:rPr>
-                <w:rFonts w:ascii="Arial" w:eastAsia="Times New Roman" w:hAnsi="Arial" w:cs="Arial"/>
-                <w:color w:val="000000"/>
-                <w:kern w:val="0"/>
-                <w:sz w:val="28"/>
-                <w:szCs w:val="28"/>
-                <w14:ligatures w14:val="none"/>
-              </w:rPr>
-              <w:t> </w:t>
-            </w:r>
-          </w:p>
-        </w:tc>
-        <w:tc>
-          <w:tcPr>
-            <w:tcW w:w="0" w:type="auto"/>
-            <w:tcBorders>
-              <w:top w:val="single" w:sz="12" w:space="0" w:color="000000"/>
-              <w:left w:val="single" w:sz="12" w:space="0" w:color="000000"/>
-              <w:bottom w:val="single" w:sz="12" w:space="0" w:color="000000"/>
-              <w:right w:val="single" w:sz="12" w:space="0" w:color="000000"/>
-            </w:tcBorders>
-            <w:tcMar>
-              <w:top w:w="0" w:type="dxa"/>
-              <w:left w:w="100" w:type="dxa"/>
-              <w:bottom w:w="0" w:type="dxa"/>
-              <w:right w:w="100" w:type="dxa"/>
-            </w:tcMar>
-            <w:hideMark/>
-          </w:tcPr>
-          <w:p>
-            <w:pPr>
-              <w:spacing w:after="200" w:line="240" w:lineRule="auto"/>
-              <w:rPr>
-                <w:rFonts w:ascii="Times New Roman" w:eastAsia="Times New Roman" w:hAnsi="Times New Roman" w:cs="Times New Roman"/>
-                <w:kern w:val="0"/>
-                <w14:ligatures w14:val="none"/>
-              </w:rPr>
-            </w:pPr>
-            <w:r>
-              <w:rPr>
-                <w:rFonts w:ascii="Arial" w:eastAsia="Times New Roman" w:hAnsi="Arial" w:cs="Arial"/>
-                <w:color w:val="000000"/>
-                <w:kern w:val="0"/>
-                <w:sz w:val="28"/>
-                <w:szCs w:val="28"/>
-                <w14:ligatures w14:val="none"/>
-              </w:rPr>
-              <w:t> </w:t>
-            </w:r>
-          </w:p>
-        </w:tc>
-        <w:tc>
-          <w:tcPr>
-            <w:tcW w:w="0" w:type="auto"/>
-            <w:tcBorders>
-              <w:top w:val="single" w:sz="12" w:space="0" w:color="000000"/>
-              <w:left w:val="single" w:sz="12" w:space="0" w:color="000000"/>
-              <w:bottom w:val="single" w:sz="12" w:space="0" w:color="000000"/>
-              <w:right w:val="single" w:sz="12" w:space="0" w:color="000000"/>
-            </w:tcBorders>
-            <w:tcMar>
-              <w:top w:w="0" w:type="dxa"/>
-              <w:left w:w="100" w:type="dxa"/>
-              <w:bottom w:w="0" w:type="dxa"/>
-              <w:right w:w="100" w:type="dxa"/>
-            </w:tcMar>
-            <w:hideMark/>
-          </w:tcPr>
-          <w:p>
-            <w:pPr>
-              <w:spacing w:after="200" w:line="240" w:lineRule="auto"/>
-              <w:rPr>
-                <w:rFonts w:ascii="Times New Roman" w:eastAsia="Times New Roman" w:hAnsi="Times New Roman" w:cs="Times New Roman"/>
-                <w:kern w:val="0"/>
-                <w14:ligatures w14:val="none"/>
-              </w:rPr>
-            </w:pPr>
-            <w:r>
-              <w:rPr>
-                <w:rFonts w:ascii="Arial" w:eastAsia="Times New Roman" w:hAnsi="Arial" w:cs="Arial"/>
-                <w:color w:val="000000"/>
-                <w:kern w:val="0"/>
-                <w:sz w:val="28"/>
-                <w:szCs w:val="28"/>
-                <w14:ligatures w14:val="none"/>
-              </w:rPr>
-              <w:t> </w:t>
-            </w:r>
-          </w:p>
-        </w:tc>
-        <w:tc>
-          <w:tcPr>
-            <w:tcW w:w="0" w:type="auto"/>
-            <w:tcBorders>
-              <w:top w:val="single" w:sz="12" w:space="0" w:color="000000"/>
-              <w:left w:val="single" w:sz="12" w:space="0" w:color="000000"/>
-              <w:bottom w:val="single" w:sz="12" w:space="0" w:color="000000"/>
-              <w:right w:val="single" w:sz="12" w:space="0" w:color="000000"/>
-            </w:tcBorders>
-            <w:tcMar>
-              <w:top w:w="0" w:type="dxa"/>
-              <w:left w:w="100" w:type="dxa"/>
-              <w:bottom w:w="0" w:type="dxa"/>
-              <w:right w:w="100" w:type="dxa"/>
-            </w:tcMar>
-            <w:hideMark/>
-          </w:tcPr>
-          <w:p>
-            <w:pPr>
-              <w:spacing w:after="0" w:line="240" w:lineRule="auto"/>
-              <w:rPr>
-                <w:rFonts w:ascii="Times New Roman" w:eastAsia="Times New Roman" w:hAnsi="Times New Roman" w:cs="Times New Roman"/>
-                <w:kern w:val="0"/>
-                <w14:ligatures w14:val="none"/>
-              </w:rPr>
-            </w:pPr>
-          </w:p>
-        </w:tc>
-        <w:tc>
-          <w:tcPr>
-            <w:tcW w:w="0" w:type="auto"/>
-            <w:tcBorders>
-              <w:top w:val="single" w:sz="12" w:space="0" w:color="000000"/>
-              <w:left w:val="single" w:sz="12" w:space="0" w:color="000000"/>
-              <w:bottom w:val="single" w:sz="12" w:space="0" w:color="000000"/>
-              <w:right w:val="single" w:sz="12" w:space="0" w:color="000000"/>
-            </w:tcBorders>
-            <w:tcMar>
-              <w:top w:w="0" w:type="dxa"/>
-              <w:left w:w="100" w:type="dxa"/>
-              <w:bottom w:w="0" w:type="dxa"/>
-              <w:right w:w="100" w:type="dxa"/>
-            </w:tcMar>
-            <w:hideMark/>
-          </w:tcPr>
-          <w:p>
-            <w:pPr>
-              <w:spacing w:after="0" w:line="240" w:lineRule="auto"/>
-              <w:rPr>
-                <w:rFonts w:ascii="Times New Roman" w:eastAsia="Times New Roman" w:hAnsi="Times New Roman" w:cs="Times New Roman"/>
-                <w:kern w:val="0"/>
-                <w14:ligatures w14:val="none"/>
-              </w:rPr>
-            </w:pPr>
-          </w:p>
-        </w:tc>
-      </w:tr>
-      <w:tr>
-        <w:trPr>
-          <w:trHeight w:val="585"/>
-        </w:trPr>
-        <w:tc>
-          <w:tcPr>
-            <w:tcW w:w="0" w:type="auto"/>
-            <w:tcBorders>
-              <w:top w:val="single" w:sz="12" w:space="0" w:color="000000"/>
-              <w:left w:val="single" w:sz="12" w:space="0" w:color="000000"/>
-              <w:bottom w:val="single" w:sz="12" w:space="0" w:color="000000"/>
-              <w:right w:val="single" w:sz="12" w:space="0" w:color="000000"/>
-            </w:tcBorders>
-            <w:tcMar>
-              <w:top w:w="0" w:type="dxa"/>
-              <w:left w:w="100" w:type="dxa"/>
-              <w:bottom w:w="0" w:type="dxa"/>
-              <w:right w:w="100" w:type="dxa"/>
-            </w:tcMar>
-            <w:hideMark/>
-          </w:tcPr>
-          <w:p>
-            <w:pPr>
-              <w:spacing w:after="200" w:line="240" w:lineRule="auto"/>
-              <w:rPr>
-                <w:rFonts w:ascii="Times New Roman" w:eastAsia="Times New Roman" w:hAnsi="Times New Roman" w:cs="Times New Roman"/>
-                <w:kern w:val="0"/>
-                <w14:ligatures w14:val="none"/>
-              </w:rPr>
-            </w:pPr>
-            <w:r>
-              <w:rPr>
-                <w:rFonts w:ascii="Arial" w:eastAsia="Times New Roman" w:hAnsi="Arial" w:cs="Arial"/>
-                <w:color w:val="000000"/>
-                <w:kern w:val="0"/>
-                <w:sz w:val="28"/>
-                <w:szCs w:val="28"/>
-                <w14:ligatures w14:val="none"/>
-              </w:rPr>
-              <w:t> </w:t>
-            </w:r>
-          </w:p>
-        </w:tc>
-        <w:tc>
-          <w:tcPr>
-            <w:tcW w:w="0" w:type="auto"/>
-            <w:tcBorders>
-              <w:top w:val="single" w:sz="12" w:space="0" w:color="000000"/>
-              <w:left w:val="single" w:sz="12" w:space="0" w:color="000000"/>
-              <w:bottom w:val="single" w:sz="12" w:space="0" w:color="000000"/>
-              <w:right w:val="single" w:sz="12" w:space="0" w:color="000000"/>
-            </w:tcBorders>
-            <w:tcMar>
-              <w:top w:w="0" w:type="dxa"/>
-              <w:left w:w="100" w:type="dxa"/>
-              <w:bottom w:w="0" w:type="dxa"/>
-              <w:right w:w="100" w:type="dxa"/>
-            </w:tcMar>
-            <w:hideMark/>
-          </w:tcPr>
-          <w:p>
-            <w:pPr>
-              <w:spacing w:after="200" w:line="240" w:lineRule="auto"/>
-              <w:rPr>
-                <w:rFonts w:ascii="Times New Roman" w:eastAsia="Times New Roman" w:hAnsi="Times New Roman" w:cs="Times New Roman"/>
-                <w:kern w:val="0"/>
-                <w14:ligatures w14:val="none"/>
-              </w:rPr>
-            </w:pPr>
-            <w:r>
-              <w:rPr>
-                <w:rFonts w:ascii="Arial" w:eastAsia="Times New Roman" w:hAnsi="Arial" w:cs="Arial"/>
-                <w:color w:val="000000"/>
-                <w:kern w:val="0"/>
-                <w:sz w:val="28"/>
-                <w:szCs w:val="28"/>
-                <w14:ligatures w14:val="none"/>
-              </w:rPr>
-              <w:t> </w:t>
-            </w:r>
-          </w:p>
-        </w:tc>
-        <w:tc>
-          <w:tcPr>
-            <w:tcW w:w="0" w:type="auto"/>
-            <w:tcBorders>
-              <w:top w:val="single" w:sz="12" w:space="0" w:color="000000"/>
-              <w:left w:val="single" w:sz="12" w:space="0" w:color="000000"/>
-              <w:bottom w:val="single" w:sz="12" w:space="0" w:color="000000"/>
-              <w:right w:val="single" w:sz="12" w:space="0" w:color="000000"/>
-            </w:tcBorders>
-            <w:tcMar>
-              <w:top w:w="0" w:type="dxa"/>
-              <w:left w:w="100" w:type="dxa"/>
-              <w:bottom w:w="0" w:type="dxa"/>
-              <w:right w:w="100" w:type="dxa"/>
-            </w:tcMar>
-            <w:hideMark/>
-          </w:tcPr>
-          <w:p>
-            <w:pPr>
-              <w:spacing w:after="200" w:line="240" w:lineRule="auto"/>
-              <w:rPr>
-                <w:rFonts w:ascii="Times New Roman" w:eastAsia="Times New Roman" w:hAnsi="Times New Roman" w:cs="Times New Roman"/>
-                <w:kern w:val="0"/>
-                <w14:ligatures w14:val="none"/>
-              </w:rPr>
-            </w:pPr>
-            <w:r>
-              <w:rPr>
-                <w:rFonts w:ascii="Arial" w:eastAsia="Times New Roman" w:hAnsi="Arial" w:cs="Arial"/>
-                <w:color w:val="000000"/>
-                <w:kern w:val="0"/>
-                <w:sz w:val="28"/>
-                <w:szCs w:val="28"/>
-                <w14:ligatures w14:val="none"/>
-              </w:rPr>
-              <w:t> </w:t>
-            </w:r>
-          </w:p>
-        </w:tc>
-        <w:tc>
-          <w:tcPr>
-            <w:tcW w:w="0" w:type="auto"/>
-            <w:tcBorders>
-              <w:top w:val="single" w:sz="12" w:space="0" w:color="000000"/>
-              <w:left w:val="single" w:sz="12" w:space="0" w:color="000000"/>
-              <w:bottom w:val="single" w:sz="12" w:space="0" w:color="000000"/>
-              <w:right w:val="single" w:sz="12" w:space="0" w:color="000000"/>
-            </w:tcBorders>
-            <w:tcMar>
-              <w:top w:w="0" w:type="dxa"/>
-              <w:left w:w="100" w:type="dxa"/>
-              <w:bottom w:w="0" w:type="dxa"/>
-              <w:right w:w="100" w:type="dxa"/>
-            </w:tcMar>
-            <w:hideMark/>
-          </w:tcPr>
-          <w:p>
-            <w:pPr>
-              <w:spacing w:after="0" w:line="240" w:lineRule="auto"/>
-              <w:rPr>
-                <w:rFonts w:ascii="Times New Roman" w:eastAsia="Times New Roman" w:hAnsi="Times New Roman" w:cs="Times New Roman"/>
-                <w:kern w:val="0"/>
-                <w14:ligatures w14:val="none"/>
-              </w:rPr>
-            </w:pPr>
-          </w:p>
-        </w:tc>
-        <w:tc>
-          <w:tcPr>
-            <w:tcW w:w="0" w:type="auto"/>
-            <w:tcBorders>
-              <w:top w:val="single" w:sz="12" w:space="0" w:color="000000"/>
-              <w:left w:val="single" w:sz="12" w:space="0" w:color="000000"/>
-              <w:bottom w:val="single" w:sz="12" w:space="0" w:color="000000"/>
-              <w:right w:val="single" w:sz="12" w:space="0" w:color="000000"/>
-            </w:tcBorders>
-            <w:tcMar>
-              <w:top w:w="0" w:type="dxa"/>
-              <w:left w:w="100" w:type="dxa"/>
-              <w:bottom w:w="0" w:type="dxa"/>
-              <w:right w:w="100" w:type="dxa"/>
-            </w:tcMar>
-            <w:hideMark/>
-          </w:tcPr>
-          <w:p>
-            <w:pPr>
-              <w:spacing w:after="0" w:line="240" w:lineRule="auto"/>
-              <w:rPr>
-                <w:rFonts w:ascii="Times New Roman" w:eastAsia="Times New Roman" w:hAnsi="Times New Roman" w:cs="Times New Roman"/>
-                <w:kern w:val="0"/>
-                <w14:ligatures w14:val="none"/>
-              </w:rPr>
-            </w:pPr>
-          </w:p>
-        </w:tc>
-      </w:tr>
     </w:tbl>
     <w:p>
       <w:pPr>
@@ -3852,26 +3514,6 @@
         </w:rPr>
         <w:t> </w:t>
       </w:r>
-    </w:p>
-    <w:p>
-      <w:pPr>
-        <w:spacing w:after="240" w:line="240" w:lineRule="auto"/>
-        <w:rPr>
-          <w:rFonts w:ascii="Times New Roman" w:eastAsia="Times New Roman" w:hAnsi="Times New Roman" w:cs="Times New Roman"/>
-          <w:kern w:val="0"/>
-          <w14:ligatures w14:val="none"/>
-        </w:rPr>
-      </w:pPr>
-    </w:p>
-    <w:p>
-      <w:pPr>
-        <w:spacing w:after="0" w:line="240" w:lineRule="auto"/>
-        <w:rPr>
-          <w:rFonts w:ascii="Times New Roman" w:eastAsia="Times New Roman" w:hAnsi="Times New Roman" w:cs="Times New Roman"/>
-          <w:kern w:val="0"/>
-          <w14:ligatures w14:val="none"/>
-        </w:rPr>
-      </w:pPr>
     </w:p>
     <w:p/>
     <w:sectPr>

</xml_diff>